<commit_message>
Update Word Document with exact text and checkboxes
</commit_message>
<xml_diff>
--- a/week1-personal-info/Project_Documentation.docx
+++ b/week1-personal-info/Project_Documentation.docx
@@ -32,33 +32,21 @@
       </w:r>
     </w:p>
     <w:p>
-      <w:pPr>
-        <w:pStyle w:val="ListBullet"/>
-      </w:pPr>
       <w:r>
         <w:t>Variables: How to store different types of data</w:t>
       </w:r>
     </w:p>
     <w:p>
-      <w:pPr>
-        <w:pStyle w:val="ListBullet"/>
-      </w:pPr>
       <w:r>
         <w:t>Input/Output: Getting user input and displaying results</w:t>
       </w:r>
     </w:p>
     <w:p>
-      <w:pPr>
-        <w:pStyle w:val="ListBullet"/>
-      </w:pPr>
       <w:r>
         <w:t>String Formatting: Using f-strings to create nice output</w:t>
       </w:r>
     </w:p>
     <w:p>
-      <w:pPr>
-        <w:pStyle w:val="ListBullet"/>
-      </w:pPr>
       <w:r>
         <w:t>Error Handling: Basic validation for user input</w:t>
       </w:r>
@@ -72,41 +60,26 @@
       </w:r>
     </w:p>
     <w:p>
-      <w:pPr>
-        <w:pStyle w:val="ListNumber"/>
-      </w:pPr>
       <w:r>
         <w:t>Make sure you have Python installed</w:t>
       </w:r>
     </w:p>
     <w:p>
-      <w:pPr>
-        <w:pStyle w:val="ListNumber"/>
-      </w:pPr>
       <w:r>
         <w:t>Open terminal/command prompt</w:t>
       </w:r>
     </w:p>
     <w:p>
-      <w:pPr>
-        <w:pStyle w:val="ListNumber"/>
-      </w:pPr>
       <w:r>
         <w:t>Navigate to the project folder</w:t>
       </w:r>
     </w:p>
     <w:p>
-      <w:pPr>
-        <w:pStyle w:val="ListNumber"/>
-      </w:pPr>
       <w:r>
         <w:t>Run: python personal_info.py</w:t>
       </w:r>
     </w:p>
     <w:p>
-      <w:pPr>
-        <w:pStyle w:val="ListNumber"/>
-      </w:pPr>
       <w:r>
         <w:t>Follow the prompts to enter your information</w:t>
       </w:r>
@@ -120,41 +93,26 @@
       </w:r>
     </w:p>
     <w:p>
-      <w:pPr>
-        <w:pStyle w:val="ListBullet"/>
-      </w:pPr>
       <w:r>
         <w:t>Stores static information (name, age, city, hobby)</w:t>
       </w:r>
     </w:p>
     <w:p>
-      <w:pPr>
-        <w:pStyle w:val="ListBullet"/>
-      </w:pPr>
       <w:r>
         <w:t>Gets dynamic information from user (favorite food, color)</w:t>
       </w:r>
     </w:p>
     <w:p>
-      <w:pPr>
-        <w:pStyle w:val="ListBullet"/>
-      </w:pPr>
       <w:r>
         <w:t>Displays all information in a formatted way</w:t>
       </w:r>
     </w:p>
     <w:p>
-      <w:pPr>
-        <w:pStyle w:val="ListBullet"/>
-      </w:pPr>
       <w:r>
         <w:t>Basic input validation</w:t>
       </w:r>
     </w:p>
     <w:p>
-      <w:pPr>
-        <w:pStyle w:val="ListBullet"/>
-      </w:pPr>
       <w:r>
         <w:t>Age calculation in months</w:t>
       </w:r>
@@ -169,30 +127,56 @@
     </w:p>
     <w:p>
       <w:r>
-        <w:rPr>
-          <w:rFonts w:ascii="Courier New" w:hAnsi="Courier New"/>
-        </w:rPr>
         <w:t>===================================</w:t>
-        <w:br/>
+      </w:r>
+    </w:p>
+    <w:p>
+      <w:r>
         <w:t xml:space="preserve">     PERSONAL INFORMATION</w:t>
-        <w:br/>
+      </w:r>
+    </w:p>
+    <w:p>
+      <w:r>
         <w:t>===================================</w:t>
-        <w:br/>
+      </w:r>
+    </w:p>
+    <w:p>
+      <w:r>
         <w:t>Name: John Doe</w:t>
-        <w:br/>
+      </w:r>
+    </w:p>
+    <w:p>
+      <w:r>
         <w:t>Age: 25 (300 months old)</w:t>
-        <w:br/>
+      </w:r>
+    </w:p>
+    <w:p>
+      <w:r>
         <w:t>City: New York</w:t>
-        <w:br/>
+      </w:r>
+    </w:p>
+    <w:p>
+      <w:r>
         <w:t>Hobby: Reading</w:t>
-        <w:br/>
-        <w:br/>
+      </w:r>
+    </w:p>
+    <w:p>
+      <w:r>
         <w:t>Favorite Food: Pizza</w:t>
-        <w:br/>
+      </w:r>
+    </w:p>
+    <w:p>
+      <w:r>
         <w:t>Favorite Color: Blue</w:t>
-        <w:br/>
+      </w:r>
+    </w:p>
+    <w:p>
+      <w:r>
         <w:t>===================================</w:t>
-        <w:br/>
+      </w:r>
+    </w:p>
+    <w:p>
+      <w:r>
         <w:t>Thank you for using the program!</w:t>
       </w:r>
     </w:p>
@@ -205,9 +189,6 @@
       </w:r>
     </w:p>
     <w:p>
-      <w:pPr>
-        <w:pStyle w:val="ListBullet"/>
-      </w:pPr>
       <w:r>
         <w:t>Challenge: User might enter empty input</w:t>
       </w:r>
@@ -218,9 +199,6 @@
       </w:r>
     </w:p>
     <w:p>
-      <w:pPr>
-        <w:pStyle w:val="ListBullet"/>
-      </w:pPr>
       <w:r>
         <w:t>Challenge: Formatting the output nicely</w:t>
       </w:r>
@@ -244,87 +222,33 @@
       </w:r>
     </w:p>
     <w:p>
-      <w:pPr>
-        <w:pStyle w:val="ListBullet"/>
-      </w:pPr>
       <w:r>
-        <w:rPr>
-          <w:b/>
-        </w:rPr>
-        <w:t xml:space="preserve">Project Overview: </w:t>
-      </w:r>
-      <w:r>
-        <w:t>Clear description of project goals and objectives</w:t>
+        <w:t>[x] Project Overview: Clear description of project goals and objectives</w:t>
       </w:r>
     </w:p>
     <w:p>
-      <w:pPr>
-        <w:pStyle w:val="ListBullet"/>
-      </w:pPr>
       <w:r>
-        <w:rPr>
-          <w:b/>
-        </w:rPr>
-        <w:t xml:space="preserve">Setup Instructions: </w:t>
-      </w:r>
-      <w:r>
-        <w:t>Step-by-step installation and configuration guide</w:t>
+        <w:t>[x] Setup Instructions: Step-by-step installation and configuration guide</w:t>
       </w:r>
     </w:p>
     <w:p>
-      <w:pPr>
-        <w:pStyle w:val="ListBullet"/>
-      </w:pPr>
       <w:r>
-        <w:rPr>
-          <w:b/>
-        </w:rPr>
-        <w:t xml:space="preserve">Code Structure: </w:t>
-      </w:r>
-      <w:r>
-        <w:t>Well-organized code with clear file hierarchy</w:t>
+        <w:t>[x] Code Structure: Well-organized code with clear file hierarchy</w:t>
       </w:r>
     </w:p>
     <w:p>
-      <w:pPr>
-        <w:pStyle w:val="ListBullet"/>
-      </w:pPr>
       <w:r>
-        <w:rPr>
-          <w:b/>
-        </w:rPr>
-        <w:t xml:space="preserve">Visual Documentation: </w:t>
-      </w:r>
-      <w:r>
-        <w:t>Screenshots demonstrating functionality</w:t>
+        <w:t>[x] Visual Documentation: Screenshots demonstrating functionality</w:t>
       </w:r>
     </w:p>
     <w:p>
-      <w:pPr>
-        <w:pStyle w:val="ListBullet"/>
-      </w:pPr>
       <w:r>
-        <w:rPr>
-          <w:b/>
-        </w:rPr>
-        <w:t xml:space="preserve">Technical Details: </w:t>
-      </w:r>
-      <w:r>
-        <w:t>Explanation of algorithms, data structures, and architecture</w:t>
+        <w:t>[x] Technical Details: Explanation of algorithms, data structures, and architecture</w:t>
       </w:r>
     </w:p>
     <w:p>
-      <w:pPr>
-        <w:pStyle w:val="ListBullet"/>
-      </w:pPr>
       <w:r>
-        <w:rPr>
-          <w:b/>
-        </w:rPr>
-        <w:t xml:space="preserve">Testing Evidence: </w:t>
-      </w:r>
-      <w:r>
-        <w:t>Examples of test cases and validation</w:t>
+        <w:t>[x] Testing Evidence: Examples of test cases and validation</w:t>
       </w:r>
     </w:p>
     <w:sectPr>

</xml_diff>